<commit_message>
refactor: sesuaikan sistem untuk tanda tangan basah dan stempel, bersihkan klaim TTE BSrE, perbaiki link PDF, data Jeneponto dan kades JUSMAEDY, S.Pd
</commit_message>
<xml_diff>
--- a/FORM_B_PROGRAM_KERJA_LENTERA_DESA_REVISI.docx
+++ b/FORM_B_PROGRAM_KERJA_LENTERA_DESA_REVISI.docx
@@ -483,7 +483,7 @@
               <w:rPr>
                 <w:sz w:val="21"/>
               </w:rPr>
-              <w:t>Oleh karena itu, dikembangkan inovasi sistem terintegrasi 'LENTERA DESA' (Website Pelayanan Mandiri dan Aplikasi Android) agar masyarakat Desa Jombe dapat mengajukan permohonan surat administrasi secara langsung secara mandiri, melacak status berkas secara transparan, serta mengunduh dokumen surat resmi berformat PDF yang dilengkapi tanda tangan elektronik (TTE) berbasis QR Code tanpa terkendala jarak dan waktu.</w:t>
+              <w:t>Oleh karena itu, dikembangkan inovasi sistem terintegrasi 'LENTERA DESA' (Website Pelayanan Mandiri dan Aplikasi Android) agar masyarakat Desa Jombe dapat mengajukan permohonan surat administrasi secara langsung secara mandiri, melacak status berkas secara transparan, serta mengunduh dokumen surat resmi berformat PDF standar yang siap dicetak (print) dan dibubuhi tanda tangan basah Kepala Desa serta cap stempel resmi kantor desa tanpa terkendala jarak dan antrean panjang.</w:t>
             </w:r>
           </w:p>
         </w:tc>
@@ -562,7 +562,7 @@
               <w:rPr>
                 <w:sz w:val="21"/>
               </w:rPr>
-              <w:t>3. Memodernisasi tata kelola administrasi kantor desa dengan dashboard operator untuk verifikasi berkas digital dan penerbitan surat resmi otomatis ber-kop Desa Jombe.</w:t>
+              <w:t>3. Memodernisasi tata kelola administrasi kantor desa dengan dashboard operator untuk verifikasi berkas persyaratan dan penerbitan otomatis surat keterangan resmi ber-kop Desa Jombe.</w:t>
             </w:r>
           </w:p>
           <w:p>
@@ -574,7 +574,7 @@
               <w:rPr>
                 <w:sz w:val="21"/>
               </w:rPr>
-              <w:t>4. Menjamin keabsahan dokumen kependudukan melalui sistem verifikasi Tanda Tangan Elektronik (TTE) berbasis QR Code / Barcode yang dapat divalidasi secara publik.</w:t>
+              <w:t>4. Menjamin keabsahan dokumen kependudukan melalui pencetakan surat PDF resmi ber-QR Code registrasi arsip yang ditandatangani basah oleh Kepala Desa Jombe serta dibubuhi cap stempel basah kantor desa.</w:t>
             </w:r>
           </w:p>
           <w:p>
@@ -1172,7 +1172,7 @@
               <w:rPr>
                 <w:sz w:val="21"/>
               </w:rPr>
-              <w:t>3. Tersedianya Dashboard Operator Desa untuk mengelola, memverifikasi berkas, dan menerbitkan surat keterangan berformat PDF resmi.</w:t>
+              <w:t>3. Tersedianya Dashboard Operator Desa untuk mengelola, memverifikasi berkas, dan menerbitkan surat keterangan berformat PDF resmi siap cetak.</w:t>
             </w:r>
           </w:p>
           <w:p>
@@ -1184,7 +1184,7 @@
               <w:rPr>
                 <w:sz w:val="21"/>
               </w:rPr>
-              <w:t>4. Tersedianya Modul Verifikasi Keaslian Tanda Tangan Elektronik (TTE) berbasis QR Code untuk mencegah pemalsuan surat desa.</w:t>
+              <w:t>4. Tersedianya Modul Validasi Registrasi Dokumen Resmi Desa berbasis QR Code arsip untuk pencocokan keabsahan nomor surat dan data kependudukan sebelum pembubuhan tanda tangan basah dan cap stempel kantor desa.</w:t>
             </w:r>
           </w:p>
           <w:p>
@@ -2023,7 +2023,7 @@
               <w:rPr>
                 <w:sz w:val="21"/>
               </w:rPr>
-              <w:t>☐ Foto 4: Contoh hasil cetak Surat Keterangan resmi Desa Jombe berformat PDF yang dilengkapi Tanda Tangan Elektronik (TTE) dan QR Code validasi keaslian dokumen.</w:t>
+              <w:t>☐ Foto 4: Contoh hasil cetak fisik Surat Keterangan resmi Desa Jombe berformat PDF standar berkop Pemkab Jeneponto yang siap dan telah dibubuhi tanda tangan basah Kepala Desa Jombe (JUSMAEDY, S.Pd) serta cap stempel basah kantor desa.</w:t>
             </w:r>
           </w:p>
         </w:tc>

</xml_diff>